<commit_message>
Update report: Linux tested in Docker, Windows tested natively
</commit_message>
<xml_diff>
--- a/report/Skyline_Weather_Devops_Mini_Project_Report.docx
+++ b/report/Skyline_Weather_Devops_Mini_Project_Report.docx
@@ -219,7 +219,7 @@
         <w:jc w:val="both"/>
       </w:pPr>
       <w:r>
-        <w:t>This report presents Skyline Weather, a Python desktop weather application built with CustomTkinter, and the delivery pipeline around it. Two GitHub Actions workflows automate the path from commit to download. On every push and pull request, the first workflow runs eight unit tests on Linux and Windows, starts the GUI headlessly as a smoke test, and builds a Docker image stage that runs the tests and builds the Linux executable. When a version tag is pushed, the second workflow tests the code again, builds native executables for Windows and Linux on both x64 and ARM64 with PyInstaller, and publishes them with SHA-256 checksums to GitHub Releases.</w:t>
+        <w:t>This report presents Skyline Weather, a Python desktop weather application built with CustomTkinter, and the delivery pipeline around it. Two GitHub Actions workflows automate the path from commit to download. On every push and pull request, the first workflow runs eight unit tests and a GUI smoke test on both operating systems: Linux inside a Docker container and Windows natively. It also builds the Linux executable inside Docker as a check. When a version tag is pushed, the second workflow tests the code again, builds native executables for Windows and Linux on both x64 and ARM64 with PyInstaller, and publishes them with SHA-256 checksums to GitHub Releases.</w:t>
       </w:r>
     </w:p>
     <w:p>
@@ -2983,7 +2983,7 @@
         <w:jc w:val="both"/>
       </w:pPr>
       <w:r>
-        <w:t>Figure 2 shows the complete flow. A push to the main branch or a pull request starts the CI workflow, which tests the code on Linux and Windows and builds the Docker stages. Pushing a version tag starts the release workflow: it tests again, builds four executables in parallel and publishes a GitHub Release. The download website then reads that release.</w:t>
+        <w:t>Figure 2 shows the complete flow. A push to the main branch or a pull request starts the CI workflow, which tests Linux inside Docker, tests Windows natively and checks the Linux build in Docker. Pushing a version tag starts the release workflow: it tests again, builds four executables in parallel and publishes a GitHub Release. The download website then reads that release.</w:t>
       </w:r>
     </w:p>
     <w:p>
@@ -3066,7 +3066,7 @@
         <w:jc w:val="both"/>
       </w:pPr>
       <w:r>
-        <w:t>The release workflow has three kinds of job (Figure 3). The four build jobs need the test job, and the release job needs all four builds, so nothing is published unless the tests pass and every target builds.</w:t>
+        <w:t>The release workflow has three kinds of job (Figure 3). The four build jobs need both test jobs, and the release job needs all four builds, so nothing is published unless the tests pass on both systems and every target builds.</w:t>
       </w:r>
     </w:p>
     <w:p>
@@ -3082,7 +3082,7 @@
         </w:rPr>
         <w:drawing>
           <wp:inline distT="0" distB="0" distL="0" distR="0" wp14:anchorId="3C36F206" wp14:editId="22EF9232">
-            <wp:extent cx="3617194" cy="2300000"/>
+            <wp:extent cx="3922504" cy="2300000"/>
             <wp:effectExtent l="0" t="0" r="0" b="0"/>
             <wp:docPr id="949318135" name="fig5" descr="Job dependency graph" title="Job dependency graph"/>
             <wp:cNvGraphicFramePr>
@@ -3107,7 +3107,7 @@
                   <pic:spPr bwMode="auto">
                     <a:xfrm>
                       <a:off x="0" y="0"/>
-                      <a:ext cx="3617194" cy="2300000"/>
+                      <a:ext cx="3922504" cy="2300000"/>
                     </a:xfrm>
                     <a:prstGeom prst="rect">
                       <a:avLst/>
@@ -3308,7 +3308,7 @@
                 <w:sz w:val="20"/>
                 <w:szCs w:val="20"/>
               </w:rPr>
-              <w:t>ci.yml: tests on Ubuntu and Windows, GUI smoke test, Docker stages</w:t>
+              <w:t>ci.yml: Linux tests in Docker, Windows tests, Docker build check</w:t>
             </w:r>
           </w:p>
         </w:tc>
@@ -4815,7 +4815,7 @@
         <w:jc w:val="both"/>
       </w:pPr>
       <w:r>
-        <w:t>The ci.yml workflow runs on every push to main and on pull requests. Its test job runs in a matrix on ubuntu-latest and windows-latest with Python 3.12, so platform-specific problems are caught early. A second job builds the Dockerfile stages.</w:t>
+        <w:t>The ci.yml workflow runs on every push to main and on pull requests. It runs two test jobs in parallel. Linux is tested inside a Docker container, using the test stage of the Dockerfile. Windows is tested natively on windows-latest with Python 3.12, because GitHub's Windows runners cannot run Linux containers. A third job builds the Linux executable in Docker.</w:t>
       </w:r>
     </w:p>
     <w:p>
@@ -5045,7 +5045,7 @@
                 <w:sz w:val="20"/>
                 <w:szCs w:val="20"/>
               </w:rPr>
-              <w:t>Fetch the source</w:t>
+              <w:t>Fetch the source (both test jobs)</w:t>
             </w:r>
           </w:p>
         </w:tc>
@@ -5108,7 +5108,7 @@
                 <w:sz w:val="20"/>
                 <w:szCs w:val="20"/>
               </w:rPr>
-              <w:t>actions/setup-python@v5, Python 3.12, pip cache</w:t>
+              <w:t>docker build --target test (Linux job)</w:t>
             </w:r>
           </w:p>
         </w:tc>
@@ -5137,7 +5137,7 @@
                 <w:sz w:val="20"/>
                 <w:szCs w:val="20"/>
               </w:rPr>
-              <w:t>Runtime with dependency caching</w:t>
+              <w:t>Run pytest, then the GUI smoke test, inside a clean container</w:t>
             </w:r>
           </w:p>
         </w:tc>
@@ -5200,7 +5200,7 @@
                 <w:sz w:val="20"/>
                 <w:szCs w:val="20"/>
               </w:rPr>
-              <w:t>pip install -r requirements-dev.txt</w:t>
+              <w:t>actions/setup-python@v5, Python 3.12 (Windows job)</w:t>
             </w:r>
           </w:p>
         </w:tc>
@@ -5229,7 +5229,7 @@
                 <w:sz w:val="20"/>
                 <w:szCs w:val="20"/>
               </w:rPr>
-              <w:t>Install application and test dependencies</w:t>
+              <w:t>Runtime with dependency caching</w:t>
             </w:r>
           </w:p>
         </w:tc>
@@ -5292,7 +5292,7 @@
                 <w:sz w:val="20"/>
                 <w:szCs w:val="20"/>
               </w:rPr>
-              <w:t>pytest -q</w:t>
+              <w:t>pip install -r requirements-dev.txt</w:t>
             </w:r>
           </w:p>
         </w:tc>
@@ -5321,7 +5321,7 @@
                 <w:sz w:val="20"/>
                 <w:szCs w:val="20"/>
               </w:rPr>
-              <w:t>Run the 8 unit tests</w:t>
+              <w:t>Install application and test dependencies</w:t>
             </w:r>
           </w:p>
         </w:tc>
@@ -5384,7 +5384,7 @@
                 <w:sz w:val="20"/>
                 <w:szCs w:val="20"/>
               </w:rPr>
-              <w:t>xvfb-run python (Linux only)</w:t>
+              <w:t>pytest -q and python tests/smoke_gui.py</w:t>
             </w:r>
           </w:p>
         </w:tc>
@@ -5413,7 +5413,7 @@
                 <w:sz w:val="20"/>
                 <w:szCs w:val="20"/>
               </w:rPr>
-              <w:t>Open the real window headlessly for 1.5 seconds as a smoke test</w:t>
+              <w:t>Run the 8 unit tests, then open the real window briefly</w:t>
             </w:r>
           </w:p>
         </w:tc>
@@ -5476,7 +5476,7 @@
                 <w:sz w:val="20"/>
                 <w:szCs w:val="20"/>
               </w:rPr>
-              <w:t>docker build --target test and --target artifact (separate job)</w:t>
+              <w:t>docker build --target artifact (separate job)</w:t>
             </w:r>
           </w:p>
         </w:tc>
@@ -5505,7 +5505,7 @@
                 <w:sz w:val="20"/>
                 <w:szCs w:val="20"/>
               </w:rPr>
-              <w:t>Run the tests in a container and build the Linux executable</w:t>
+              <w:t>Build the Linux executable and check the recipe works</w:t>
             </w:r>
           </w:p>
         </w:tc>
@@ -5522,7 +5522,7 @@
         <w:jc w:val="both"/>
       </w:pPr>
       <w:r>
-        <w:t>The smoke test creates the application window under a virtual display and closes it after a short delay. It catches import errors and layout crashes that tests of the data layer cannot see. The Docker job exports the executable to confirm that the container build works end to end.</w:t>
+        <w:t>The smoke test creates the application window and closes it after 1.5 seconds: under a virtual display (Xvfb) inside Docker on Linux, and on the real desktop of the Windows runner. It catches import errors and layout crashes that tests of the data layer cannot see.</w:t>
       </w:r>
     </w:p>
     <w:p>
@@ -5539,7 +5539,7 @@
         <w:jc w:val="both"/>
       </w:pPr>
       <w:r>
-        <w:t>The release.yml workflow runs when a tag starting with v is pushed. A test job runs first. Four build jobs then need it and run in parallel on native runners: ubuntu-24.04, ubuntu-24.04-arm, windows-latest and windows-11-arm. Each installs the dependencies, builds a single-file executable with PyInstaller, writes a SHA-256 checksum and uploads both as an artifact.</w:t>
+        <w:t>The release.yml workflow runs when a tag starting with v is pushed. The two test jobs run first. Four build jobs then need both and run in parallel on native runners: ubuntu-24.04, ubuntu-24.04-arm, windows-latest and windows-11-arm. Each installs the dependencies, builds a single-file executable with PyInstaller, writes a SHA-256 checksum and uploads both as an artifact.</w:t>
       </w:r>
     </w:p>
     <w:p>
@@ -6505,7 +6505,7 @@
                 <w:sz w:val="20"/>
                 <w:szCs w:val="20"/>
               </w:rPr>
-              <w:t>pytest</w:t>
+              <w:t>pytest, Docker (Linux), native (Windows)</w:t>
             </w:r>
           </w:p>
         </w:tc>
@@ -6626,7 +6626,7 @@
                 <w:sz w:val="20"/>
                 <w:szCs w:val="20"/>
               </w:rPr>
-              <w:t>xvfb and Python</w:t>
+              <w:t>Xvfb (Linux), desktop (Windows)</w:t>
             </w:r>
           </w:p>
         </w:tc>
@@ -6868,7 +6868,7 @@
                 <w:sz w:val="20"/>
                 <w:szCs w:val="20"/>
               </w:rPr>
-              <w:t>needs: test, needs: build</w:t>
+              <w:t>needs: both test jobs, then all builds</w:t>
             </w:r>
           </w:p>
         </w:tc>
@@ -7162,7 +7162,7 @@
                 <w:sz w:val="20"/>
                 <w:szCs w:val="20"/>
               </w:rPr>
-              <w:t>WORKDIR /app</w:t>
+              <w:t>RUN apt-get install binutils libtk8.6 xvfb xauth</w:t>
             </w:r>
           </w:p>
         </w:tc>
@@ -7191,7 +7191,7 @@
                 <w:sz w:val="20"/>
                 <w:szCs w:val="20"/>
               </w:rPr>
-              <w:t>Sets the working directory</w:t>
+              <w:t>Tk runtime, virtual screen and PyInstaller needs</w:t>
             </w:r>
           </w:p>
         </w:tc>
@@ -7351,7 +7351,7 @@
                 <w:sz w:val="20"/>
                 <w:szCs w:val="20"/>
               </w:rPr>
-              <w:t>FROM base AS test; RUN pytest -q</w:t>
+              <w:t>FROM base AS test; RUN pytest -q; RUN xvfb-run ...</w:t>
             </w:r>
           </w:p>
         </w:tc>
@@ -7380,7 +7380,7 @@
                 <w:sz w:val="20"/>
                 <w:szCs w:val="20"/>
               </w:rPr>
-              <w:t>Fails the image build if any test fails</w:t>
+              <w:t>Fails the image build if a test or the smoke test fails</w:t>
             </w:r>
           </w:p>
         </w:tc>
@@ -7443,7 +7443,7 @@
                 <w:sz w:val="20"/>
                 <w:szCs w:val="20"/>
               </w:rPr>
-              <w:t>Installs libtk8.6, checks that tkinter imports, builds the Linux executable</w:t>
+              <w:t>Checks that tkinter imports, then builds the Linux executable</w:t>
             </w:r>
           </w:p>
         </w:tc>
@@ -7777,7 +7777,7 @@
                 <w:sz w:val="20"/>
                 <w:szCs w:val="20"/>
               </w:rPr>
-              <w:t>Run the unit tests</w:t>
+              <w:t>Run the unit tests and GUI smoke test</w:t>
             </w:r>
           </w:p>
         </w:tc>
@@ -7806,7 +7806,7 @@
                 <w:sz w:val="20"/>
                 <w:szCs w:val="20"/>
               </w:rPr>
-              <w:t>ci.yml Docker job</w:t>
+              <w:t>ci.yml, release.yml</w:t>
             </w:r>
           </w:p>
         </w:tc>
@@ -7869,7 +7869,7 @@
                 <w:sz w:val="20"/>
                 <w:szCs w:val="20"/>
               </w:rPr>
-              <w:t>base plus binutils, libtk8.6</w:t>
+              <w:t>base</w:t>
             </w:r>
           </w:p>
         </w:tc>
@@ -10457,7 +10457,7 @@
         <w:jc w:val="both"/>
       </w:pPr>
       <w:r>
-        <w:t>Skyline Weather combines a small Python desktop application, two GitHub Actions workflows, a multi-stage Dockerfile and a static download site. A pushed tag now produces tested, checksummed executables for Windows and Linux on x64 and ARM64, and the download page offers them without manual deployment. The pipeline also proved its value during development: adding a Docker build of the Linux executable to CI showed that the slim Python image lacked the Tk library, a defect the unit tests could not reveal, and it was fixed in the Dockerfile.</w:t>
+        <w:t>Skyline Weather combines a small Python desktop application, two GitHub Actions workflows, a multi-stage Dockerfile and a static download site. Linux is tested inside a Docker container and Windows is tested natively, since GitHub's Windows runners cannot run Linux containers. A pushed tag now produces tested, checksummed executables for Windows and Linux on x64 and ARM64, and the download page offers them without manual deployment.</w:t>
       </w:r>
     </w:p>
     <w:p>
@@ -10549,7 +10549,7 @@
         <w:jc w:val="both"/>
       </w:pPr>
       <w:r>
-        <w:t>Publish the Docker test image to a registry and add a deployment to a container platform.</w:t>
+        <w:t>Test the finished executables automatically, for example by launching each one in CI.</w:t>
       </w:r>
     </w:p>
     <w:p>

</xml_diff>

<commit_message>
Fix stale details in report
</commit_message>
<xml_diff>
--- a/report/Skyline_Weather_Devops_Mini_Project_Report.docx
+++ b/report/Skyline_Weather_Devops_Mini_Project_Report.docx
@@ -228,7 +228,7 @@
         <w:jc w:val="both"/>
       </w:pPr>
       <w:r>
-        <w:t>A static website on GitHub Pages reads the latest release through the GitHub API, detects the visitor's operating system and CPU, and links directly to the matching download. Publishing a new tag therefore updates the download page without any manual deployment. A complete release run, with four parallel builds, finishes in under two minutes.</w:t>
+        <w:t>A static website on GitHub Pages reads the latest release through the GitHub API, detects the visitor's operating system and CPU, and links directly to the matching download. Publishing a new tag therefore updates the download page without any manual deployment. A complete release run, with four parallel builds, takes about two to three minutes.</w:t>
       </w:r>
     </w:p>
     <w:p>
@@ -1597,7 +1597,7 @@
         <w:jc w:val="both"/>
       </w:pPr>
       <w:r>
-        <w:t>A container packages an application with its runtime and libraries, so it behaves the same on every machine. A multi-stage Dockerfile defines several named stages from one base. Here one stage only runs the tests, another builds the Linux executable, and a final stage exports just that file. Building a single stage with --target gives a fast, isolated run [2].</w:t>
+        <w:t>A container packages an application with its runtime and libraries, so it behaves the same on every machine. A multi-stage Dockerfile defines several named stages from one base. Here one stage runs the tests and a GUI smoke test, another builds the Linux executable, and a final stage exports just that file. Building a single stage with --target gives a fast, isolated run [2].</w:t>
       </w:r>
     </w:p>
     <w:p>
@@ -3612,7 +3612,7 @@
           <w:sz w:val="18"/>
           <w:szCs w:val="18"/>
         </w:rPr>
-        <w:t xml:space="preserve">  .github/workflows/ci.yml         tests, smoke test, Docker stages</w:t>
+        <w:t xml:space="preserve">  .github/workflows/ci.yml         Linux tests in Docker, Windows tests, Docker build</w:t>
       </w:r>
     </w:p>
     <w:p>
@@ -3726,7 +3726,7 @@
           <w:sz w:val="18"/>
           <w:szCs w:val="18"/>
         </w:rPr>
-        <w:t xml:space="preserve">  docs/index.html                  GitHub Pages download site</w:t>
+        <w:t xml:space="preserve">  tests/smoke_gui.py               headless GUI smoke test</w:t>
       </w:r>
     </w:p>
     <w:p>
@@ -3745,13 +3745,48 @@
           <w:sz w:val="18"/>
           <w:szCs w:val="18"/>
         </w:rPr>
+        <w:t xml:space="preserve">  docs/index.html                  GitHub Pages download site</w:t>
+      </w:r>
+    </w:p>
+    <w:p>
+      <w:pPr>
+        <w:pBdr>
+          <w:left w:val="single" w:sz="4" w:space="0" w:color="A6A6A6"/>
+          <w:bottom w:val="single" w:sz="4" w:space="0" w:color="A6A6A6"/>
+          <w:right w:val="single" w:sz="4" w:space="0" w:color="A6A6A6"/>
+        </w:pBdr>
+        <w:shd w:val="clear" w:color="auto" w:fill="F2F2F2"/>
+        <w:spacing w:line="260" w:lineRule="auto"/>
+        <w:ind w:left="120" w:right="120"/>
+      </w:pPr>
+      <w:r>
+        <w:rPr>
+          <w:rFonts w:ascii="Courier New" w:eastAsia="Courier New" w:hAnsi="Courier New" w:cs="Courier New"/>
+          <w:sz w:val="18"/>
+          <w:szCs w:val="18"/>
+        </w:rPr>
         <w:t xml:space="preserve">  README.md                        usage and pipeline summary</w:t>
       </w:r>
     </w:p>
     <w:p>
       <w:pPr>
-        <w:spacing w:after="140"/>
-      </w:pPr>
+        <w:pBdr>
+          <w:left w:val="single" w:sz="4" w:space="0" w:color="A6A6A6"/>
+          <w:bottom w:val="single" w:sz="4" w:space="0" w:color="A6A6A6"/>
+          <w:right w:val="single" w:sz="4" w:space="0" w:color="A6A6A6"/>
+        </w:pBdr>
+        <w:shd w:val="clear" w:color="auto" w:fill="F2F2F2"/>
+        <w:spacing w:line="260" w:lineRule="auto"/>
+        <w:ind w:left="120" w:right="120"/>
+      </w:pPr>
+      <w:r>
+        <w:rPr>
+          <w:rFonts w:ascii="Courier New" w:eastAsia="Courier New" w:hAnsi="Courier New" w:cs="Courier New"/>
+          <w:sz w:val="18"/>
+          <w:szCs w:val="18"/>
+        </w:rPr>
+        <w:t xml:space="preserve">  report/                          project report</w:t>
+      </w:r>
     </w:p>
     <w:p>
       <w:pPr>
@@ -9215,6 +9250,46 @@
           <w:szCs w:val="18"/>
         </w:rPr>
         <w:t>sha256sum -c skyline-weather-linux-x64.sha256</w:t>
+      </w:r>
+    </w:p>
+    <w:p>
+      <w:pPr>
+        <w:pBdr>
+          <w:left w:val="single" w:sz="4" w:space="0" w:color="A6A6A6"/>
+          <w:bottom w:val="single" w:sz="4" w:space="0" w:color="A6A6A6"/>
+          <w:right w:val="single" w:sz="4" w:space="0" w:color="A6A6A6"/>
+        </w:pBdr>
+        <w:shd w:val="clear" w:color="auto" w:fill="F2F2F2"/>
+        <w:spacing w:line="260" w:lineRule="auto"/>
+        <w:ind w:left="120" w:right="120"/>
+      </w:pPr>
+      <w:r>
+        <w:rPr>
+          <w:rFonts w:ascii="Courier New" w:eastAsia="Courier New" w:hAnsi="Courier New" w:cs="Courier New"/>
+          <w:sz w:val="18"/>
+          <w:szCs w:val="18"/>
+        </w:rPr>
+        <w:t>chmod +x skyline-weather-linux-x64   # downloads lose the executable flag</w:t>
+      </w:r>
+    </w:p>
+    <w:p>
+      <w:pPr>
+        <w:pBdr>
+          <w:left w:val="single" w:sz="4" w:space="0" w:color="A6A6A6"/>
+          <w:bottom w:val="single" w:sz="4" w:space="0" w:color="A6A6A6"/>
+          <w:right w:val="single" w:sz="4" w:space="0" w:color="A6A6A6"/>
+        </w:pBdr>
+        <w:shd w:val="clear" w:color="auto" w:fill="F2F2F2"/>
+        <w:spacing w:line="260" w:lineRule="auto"/>
+        <w:ind w:left="120" w:right="120"/>
+      </w:pPr>
+      <w:r>
+        <w:rPr>
+          <w:rFonts w:ascii="Courier New" w:eastAsia="Courier New" w:hAnsi="Courier New" w:cs="Courier New"/>
+          <w:sz w:val="18"/>
+          <w:szCs w:val="18"/>
+        </w:rPr>
+        <w:t>./skyline-weather-linux-x64</w:t>
       </w:r>
     </w:p>
     <w:p>

</xml_diff>

<commit_message>
Fix report formatting: table widths and listing line wrap
</commit_message>
<xml_diff>
--- a/report/Skyline_Weather_Devops_Mini_Project_Report.docx
+++ b/report/Skyline_Weather_Devops_Mini_Project_Report.docx
@@ -3612,7 +3612,7 @@
           <w:sz w:val="18"/>
           <w:szCs w:val="18"/>
         </w:rPr>
-        <w:t xml:space="preserve">  .github/workflows/ci.yml         Linux tests in Docker, Windows tests, Docker build</w:t>
+        <w:t xml:space="preserve">  .github/workflows/ci.yml         tests and Docker build check</w:t>
       </w:r>
     </w:p>
     <w:p>
@@ -4006,9 +4006,9 @@
         <w:tblLook w:val="04A0" w:firstRow="1" w:lastRow="0" w:firstColumn="1" w:lastColumn="0" w:noHBand="0" w:noVBand="1"/>
       </w:tblPr>
       <w:tblGrid>
-        <w:gridCol w:w="2736"/>
-        <w:gridCol w:w="1728"/>
-        <w:gridCol w:w="4464"/>
+        <w:gridCol w:w="2766"/>
+        <w:gridCol w:w="1747"/>
+        <w:gridCol w:w="4513"/>
       </w:tblGrid>
       <w:tr>
         <w:trPr>
@@ -4017,7 +4017,7 @@
         </w:trPr>
         <w:tc>
           <w:tcPr>
-            <w:tcW w:w="2736" w:type="dxa"/>
+            <w:tcW w:w="2766" w:type="dxa"/>
             <w:tcBorders>
               <w:top w:val="single" w:sz="4" w:space="0" w:color="808080"/>
               <w:left w:val="single" w:sz="4" w:space="0" w:color="808080"/>
@@ -4049,7 +4049,7 @@
         </w:tc>
         <w:tc>
           <w:tcPr>
-            <w:tcW w:w="1728" w:type="dxa"/>
+            <w:tcW w:w="1747" w:type="dxa"/>
             <w:tcBorders>
               <w:top w:val="single" w:sz="4" w:space="0" w:color="808080"/>
               <w:left w:val="single" w:sz="4" w:space="0" w:color="808080"/>
@@ -4081,7 +4081,7 @@
         </w:tc>
         <w:tc>
           <w:tcPr>
-            <w:tcW w:w="4464" w:type="dxa"/>
+            <w:tcW w:w="4513" w:type="dxa"/>
             <w:tcBorders>
               <w:top w:val="single" w:sz="4" w:space="0" w:color="808080"/>
               <w:left w:val="single" w:sz="4" w:space="0" w:color="808080"/>
@@ -4118,7 +4118,7 @@
         </w:trPr>
         <w:tc>
           <w:tcPr>
-            <w:tcW w:w="2736" w:type="dxa"/>
+            <w:tcW w:w="2766" w:type="dxa"/>
             <w:tcBorders>
               <w:top w:val="single" w:sz="4" w:space="0" w:color="808080"/>
               <w:left w:val="single" w:sz="4" w:space="0" w:color="808080"/>
@@ -4147,7 +4147,7 @@
         </w:tc>
         <w:tc>
           <w:tcPr>
-            <w:tcW w:w="1728" w:type="dxa"/>
+            <w:tcW w:w="1747" w:type="dxa"/>
             <w:tcBorders>
               <w:top w:val="single" w:sz="4" w:space="0" w:color="808080"/>
               <w:left w:val="single" w:sz="4" w:space="0" w:color="808080"/>
@@ -4176,7 +4176,7 @@
         </w:tc>
         <w:tc>
           <w:tcPr>
-            <w:tcW w:w="4464" w:type="dxa"/>
+            <w:tcW w:w="4513" w:type="dxa"/>
             <w:tcBorders>
               <w:top w:val="single" w:sz="4" w:space="0" w:color="808080"/>
               <w:left w:val="single" w:sz="4" w:space="0" w:color="808080"/>
@@ -4210,7 +4210,7 @@
         </w:trPr>
         <w:tc>
           <w:tcPr>
-            <w:tcW w:w="2736" w:type="dxa"/>
+            <w:tcW w:w="2766" w:type="dxa"/>
             <w:tcBorders>
               <w:top w:val="single" w:sz="4" w:space="0" w:color="808080"/>
               <w:left w:val="single" w:sz="4" w:space="0" w:color="808080"/>
@@ -4239,7 +4239,7 @@
         </w:tc>
         <w:tc>
           <w:tcPr>
-            <w:tcW w:w="1728" w:type="dxa"/>
+            <w:tcW w:w="1747" w:type="dxa"/>
             <w:tcBorders>
               <w:top w:val="single" w:sz="4" w:space="0" w:color="808080"/>
               <w:left w:val="single" w:sz="4" w:space="0" w:color="808080"/>
@@ -4268,7 +4268,7 @@
         </w:tc>
         <w:tc>
           <w:tcPr>
-            <w:tcW w:w="4464" w:type="dxa"/>
+            <w:tcW w:w="4513" w:type="dxa"/>
             <w:tcBorders>
               <w:top w:val="single" w:sz="4" w:space="0" w:color="808080"/>
               <w:left w:val="single" w:sz="4" w:space="0" w:color="808080"/>
@@ -4302,7 +4302,7 @@
         </w:trPr>
         <w:tc>
           <w:tcPr>
-            <w:tcW w:w="2736" w:type="dxa"/>
+            <w:tcW w:w="2766" w:type="dxa"/>
             <w:tcBorders>
               <w:top w:val="single" w:sz="4" w:space="0" w:color="808080"/>
               <w:left w:val="single" w:sz="4" w:space="0" w:color="808080"/>
@@ -4331,7 +4331,7 @@
         </w:tc>
         <w:tc>
           <w:tcPr>
-            <w:tcW w:w="1728" w:type="dxa"/>
+            <w:tcW w:w="1747" w:type="dxa"/>
             <w:tcBorders>
               <w:top w:val="single" w:sz="4" w:space="0" w:color="808080"/>
               <w:left w:val="single" w:sz="4" w:space="0" w:color="808080"/>
@@ -4360,7 +4360,7 @@
         </w:tc>
         <w:tc>
           <w:tcPr>
-            <w:tcW w:w="4464" w:type="dxa"/>
+            <w:tcW w:w="4513" w:type="dxa"/>
             <w:tcBorders>
               <w:top w:val="single" w:sz="4" w:space="0" w:color="808080"/>
               <w:left w:val="single" w:sz="4" w:space="0" w:color="808080"/>
@@ -4394,7 +4394,7 @@
         </w:trPr>
         <w:tc>
           <w:tcPr>
-            <w:tcW w:w="2736" w:type="dxa"/>
+            <w:tcW w:w="2766" w:type="dxa"/>
             <w:tcBorders>
               <w:top w:val="single" w:sz="4" w:space="0" w:color="808080"/>
               <w:left w:val="single" w:sz="4" w:space="0" w:color="808080"/>
@@ -4423,7 +4423,7 @@
         </w:tc>
         <w:tc>
           <w:tcPr>
-            <w:tcW w:w="1728" w:type="dxa"/>
+            <w:tcW w:w="1747" w:type="dxa"/>
             <w:tcBorders>
               <w:top w:val="single" w:sz="4" w:space="0" w:color="808080"/>
               <w:left w:val="single" w:sz="4" w:space="0" w:color="808080"/>
@@ -4452,7 +4452,7 @@
         </w:tc>
         <w:tc>
           <w:tcPr>
-            <w:tcW w:w="4464" w:type="dxa"/>
+            <w:tcW w:w="4513" w:type="dxa"/>
             <w:tcBorders>
               <w:top w:val="single" w:sz="4" w:space="0" w:color="808080"/>
               <w:left w:val="single" w:sz="4" w:space="0" w:color="808080"/>
@@ -4486,7 +4486,7 @@
         </w:trPr>
         <w:tc>
           <w:tcPr>
-            <w:tcW w:w="2736" w:type="dxa"/>
+            <w:tcW w:w="2766" w:type="dxa"/>
             <w:tcBorders>
               <w:top w:val="single" w:sz="4" w:space="0" w:color="808080"/>
               <w:left w:val="single" w:sz="4" w:space="0" w:color="808080"/>
@@ -4515,7 +4515,7 @@
         </w:tc>
         <w:tc>
           <w:tcPr>
-            <w:tcW w:w="1728" w:type="dxa"/>
+            <w:tcW w:w="1747" w:type="dxa"/>
             <w:tcBorders>
               <w:top w:val="single" w:sz="4" w:space="0" w:color="808080"/>
               <w:left w:val="single" w:sz="4" w:space="0" w:color="808080"/>
@@ -4544,7 +4544,7 @@
         </w:tc>
         <w:tc>
           <w:tcPr>
-            <w:tcW w:w="4464" w:type="dxa"/>
+            <w:tcW w:w="4513" w:type="dxa"/>
             <w:tcBorders>
               <w:top w:val="single" w:sz="4" w:space="0" w:color="808080"/>
               <w:left w:val="single" w:sz="4" w:space="0" w:color="808080"/>
@@ -4578,7 +4578,7 @@
         </w:trPr>
         <w:tc>
           <w:tcPr>
-            <w:tcW w:w="2736" w:type="dxa"/>
+            <w:tcW w:w="2766" w:type="dxa"/>
             <w:tcBorders>
               <w:top w:val="single" w:sz="4" w:space="0" w:color="808080"/>
               <w:left w:val="single" w:sz="4" w:space="0" w:color="808080"/>
@@ -4607,7 +4607,7 @@
         </w:tc>
         <w:tc>
           <w:tcPr>
-            <w:tcW w:w="1728" w:type="dxa"/>
+            <w:tcW w:w="1747" w:type="dxa"/>
             <w:tcBorders>
               <w:top w:val="single" w:sz="4" w:space="0" w:color="808080"/>
               <w:left w:val="single" w:sz="4" w:space="0" w:color="808080"/>
@@ -4636,7 +4636,7 @@
         </w:tc>
         <w:tc>
           <w:tcPr>
-            <w:tcW w:w="4464" w:type="dxa"/>
+            <w:tcW w:w="4513" w:type="dxa"/>
             <w:tcBorders>
               <w:top w:val="single" w:sz="4" w:space="0" w:color="808080"/>
               <w:left w:val="single" w:sz="4" w:space="0" w:color="808080"/>
@@ -6343,10 +6343,10 @@
         <w:tblLook w:val="04A0" w:firstRow="1" w:lastRow="0" w:firstColumn="1" w:lastColumn="0" w:noHBand="0" w:noVBand="1"/>
       </w:tblPr>
       <w:tblGrid>
-        <w:gridCol w:w="1584"/>
-        <w:gridCol w:w="1872"/>
-        <w:gridCol w:w="3168"/>
-        <w:gridCol w:w="2304"/>
+        <w:gridCol w:w="1601"/>
+        <w:gridCol w:w="1893"/>
+        <w:gridCol w:w="3203"/>
+        <w:gridCol w:w="2329"/>
       </w:tblGrid>
       <w:tr>
         <w:trPr>
@@ -6355,7 +6355,7 @@
         </w:trPr>
         <w:tc>
           <w:tcPr>
-            <w:tcW w:w="1584" w:type="dxa"/>
+            <w:tcW w:w="1601" w:type="dxa"/>
             <w:tcBorders>
               <w:top w:val="single" w:sz="4" w:space="0" w:color="808080"/>
               <w:left w:val="single" w:sz="4" w:space="0" w:color="808080"/>
@@ -6387,7 +6387,7 @@
         </w:tc>
         <w:tc>
           <w:tcPr>
-            <w:tcW w:w="1872" w:type="dxa"/>
+            <w:tcW w:w="1893" w:type="dxa"/>
             <w:tcBorders>
               <w:top w:val="single" w:sz="4" w:space="0" w:color="808080"/>
               <w:left w:val="single" w:sz="4" w:space="0" w:color="808080"/>
@@ -6419,7 +6419,7 @@
         </w:tc>
         <w:tc>
           <w:tcPr>
-            <w:tcW w:w="3168" w:type="dxa"/>
+            <w:tcW w:w="3203" w:type="dxa"/>
             <w:tcBorders>
               <w:top w:val="single" w:sz="4" w:space="0" w:color="808080"/>
               <w:left w:val="single" w:sz="4" w:space="0" w:color="808080"/>
@@ -6451,7 +6451,7 @@
         </w:tc>
         <w:tc>
           <w:tcPr>
-            <w:tcW w:w="2304" w:type="dxa"/>
+            <w:tcW w:w="2329" w:type="dxa"/>
             <w:tcBorders>
               <w:top w:val="single" w:sz="4" w:space="0" w:color="808080"/>
               <w:left w:val="single" w:sz="4" w:space="0" w:color="808080"/>
@@ -6488,7 +6488,7 @@
         </w:trPr>
         <w:tc>
           <w:tcPr>
-            <w:tcW w:w="1584" w:type="dxa"/>
+            <w:tcW w:w="1601" w:type="dxa"/>
             <w:tcBorders>
               <w:top w:val="single" w:sz="4" w:space="0" w:color="808080"/>
               <w:left w:val="single" w:sz="4" w:space="0" w:color="808080"/>
@@ -6517,7 +6517,7 @@
         </w:tc>
         <w:tc>
           <w:tcPr>
-            <w:tcW w:w="1872" w:type="dxa"/>
+            <w:tcW w:w="1893" w:type="dxa"/>
             <w:tcBorders>
               <w:top w:val="single" w:sz="4" w:space="0" w:color="808080"/>
               <w:left w:val="single" w:sz="4" w:space="0" w:color="808080"/>
@@ -6546,7 +6546,7 @@
         </w:tc>
         <w:tc>
           <w:tcPr>
-            <w:tcW w:w="3168" w:type="dxa"/>
+            <w:tcW w:w="3203" w:type="dxa"/>
             <w:tcBorders>
               <w:top w:val="single" w:sz="4" w:space="0" w:color="808080"/>
               <w:left w:val="single" w:sz="4" w:space="0" w:color="808080"/>
@@ -6575,7 +6575,7 @@
         </w:tc>
         <w:tc>
           <w:tcPr>
-            <w:tcW w:w="2304" w:type="dxa"/>
+            <w:tcW w:w="2329" w:type="dxa"/>
             <w:tcBorders>
               <w:top w:val="single" w:sz="4" w:space="0" w:color="808080"/>
               <w:left w:val="single" w:sz="4" w:space="0" w:color="808080"/>
@@ -6609,7 +6609,7 @@
         </w:trPr>
         <w:tc>
           <w:tcPr>
-            <w:tcW w:w="1584" w:type="dxa"/>
+            <w:tcW w:w="1601" w:type="dxa"/>
             <w:tcBorders>
               <w:top w:val="single" w:sz="4" w:space="0" w:color="808080"/>
               <w:left w:val="single" w:sz="4" w:space="0" w:color="808080"/>
@@ -6638,7 +6638,7 @@
         </w:tc>
         <w:tc>
           <w:tcPr>
-            <w:tcW w:w="1872" w:type="dxa"/>
+            <w:tcW w:w="1893" w:type="dxa"/>
             <w:tcBorders>
               <w:top w:val="single" w:sz="4" w:space="0" w:color="808080"/>
               <w:left w:val="single" w:sz="4" w:space="0" w:color="808080"/>
@@ -6667,7 +6667,7 @@
         </w:tc>
         <w:tc>
           <w:tcPr>
-            <w:tcW w:w="3168" w:type="dxa"/>
+            <w:tcW w:w="3203" w:type="dxa"/>
             <w:tcBorders>
               <w:top w:val="single" w:sz="4" w:space="0" w:color="808080"/>
               <w:left w:val="single" w:sz="4" w:space="0" w:color="808080"/>
@@ -6696,7 +6696,7 @@
         </w:tc>
         <w:tc>
           <w:tcPr>
-            <w:tcW w:w="2304" w:type="dxa"/>
+            <w:tcW w:w="2329" w:type="dxa"/>
             <w:tcBorders>
               <w:top w:val="single" w:sz="4" w:space="0" w:color="808080"/>
               <w:left w:val="single" w:sz="4" w:space="0" w:color="808080"/>
@@ -6730,7 +6730,7 @@
         </w:trPr>
         <w:tc>
           <w:tcPr>
-            <w:tcW w:w="1584" w:type="dxa"/>
+            <w:tcW w:w="1601" w:type="dxa"/>
             <w:tcBorders>
               <w:top w:val="single" w:sz="4" w:space="0" w:color="808080"/>
               <w:left w:val="single" w:sz="4" w:space="0" w:color="808080"/>
@@ -6759,7 +6759,7 @@
         </w:tc>
         <w:tc>
           <w:tcPr>
-            <w:tcW w:w="1872" w:type="dxa"/>
+            <w:tcW w:w="1893" w:type="dxa"/>
             <w:tcBorders>
               <w:top w:val="single" w:sz="4" w:space="0" w:color="808080"/>
               <w:left w:val="single" w:sz="4" w:space="0" w:color="808080"/>
@@ -6788,7 +6788,7 @@
         </w:tc>
         <w:tc>
           <w:tcPr>
-            <w:tcW w:w="3168" w:type="dxa"/>
+            <w:tcW w:w="3203" w:type="dxa"/>
             <w:tcBorders>
               <w:top w:val="single" w:sz="4" w:space="0" w:color="808080"/>
               <w:left w:val="single" w:sz="4" w:space="0" w:color="808080"/>
@@ -6817,7 +6817,7 @@
         </w:tc>
         <w:tc>
           <w:tcPr>
-            <w:tcW w:w="2304" w:type="dxa"/>
+            <w:tcW w:w="2329" w:type="dxa"/>
             <w:tcBorders>
               <w:top w:val="single" w:sz="4" w:space="0" w:color="808080"/>
               <w:left w:val="single" w:sz="4" w:space="0" w:color="808080"/>
@@ -6851,7 +6851,7 @@
         </w:trPr>
         <w:tc>
           <w:tcPr>
-            <w:tcW w:w="1584" w:type="dxa"/>
+            <w:tcW w:w="1601" w:type="dxa"/>
             <w:tcBorders>
               <w:top w:val="single" w:sz="4" w:space="0" w:color="808080"/>
               <w:left w:val="single" w:sz="4" w:space="0" w:color="808080"/>
@@ -6880,7 +6880,7 @@
         </w:tc>
         <w:tc>
           <w:tcPr>
-            <w:tcW w:w="1872" w:type="dxa"/>
+            <w:tcW w:w="1893" w:type="dxa"/>
             <w:tcBorders>
               <w:top w:val="single" w:sz="4" w:space="0" w:color="808080"/>
               <w:left w:val="single" w:sz="4" w:space="0" w:color="808080"/>
@@ -6909,7 +6909,7 @@
         </w:tc>
         <w:tc>
           <w:tcPr>
-            <w:tcW w:w="3168" w:type="dxa"/>
+            <w:tcW w:w="3203" w:type="dxa"/>
             <w:tcBorders>
               <w:top w:val="single" w:sz="4" w:space="0" w:color="808080"/>
               <w:left w:val="single" w:sz="4" w:space="0" w:color="808080"/>
@@ -6938,7 +6938,7 @@
         </w:tc>
         <w:tc>
           <w:tcPr>
-            <w:tcW w:w="2304" w:type="dxa"/>
+            <w:tcW w:w="2329" w:type="dxa"/>
             <w:tcBorders>
               <w:top w:val="single" w:sz="4" w:space="0" w:color="808080"/>
               <w:left w:val="single" w:sz="4" w:space="0" w:color="808080"/>
@@ -7586,10 +7586,10 @@
         <w:tblLook w:val="04A0" w:firstRow="1" w:lastRow="0" w:firstColumn="1" w:lastColumn="0" w:noHBand="0" w:noVBand="1"/>
       </w:tblPr>
       <w:tblGrid>
-        <w:gridCol w:w="1296"/>
-        <w:gridCol w:w="2736"/>
-        <w:gridCol w:w="3168"/>
-        <w:gridCol w:w="1728"/>
+        <w:gridCol w:w="1310"/>
+        <w:gridCol w:w="2766"/>
+        <w:gridCol w:w="3203"/>
+        <w:gridCol w:w="1747"/>
       </w:tblGrid>
       <w:tr>
         <w:trPr>
@@ -7598,7 +7598,7 @@
         </w:trPr>
         <w:tc>
           <w:tcPr>
-            <w:tcW w:w="1296" w:type="dxa"/>
+            <w:tcW w:w="1310" w:type="dxa"/>
             <w:tcBorders>
               <w:top w:val="single" w:sz="4" w:space="0" w:color="808080"/>
               <w:left w:val="single" w:sz="4" w:space="0" w:color="808080"/>
@@ -7630,7 +7630,7 @@
         </w:tc>
         <w:tc>
           <w:tcPr>
-            <w:tcW w:w="2736" w:type="dxa"/>
+            <w:tcW w:w="2766" w:type="dxa"/>
             <w:tcBorders>
               <w:top w:val="single" w:sz="4" w:space="0" w:color="808080"/>
               <w:left w:val="single" w:sz="4" w:space="0" w:color="808080"/>
@@ -7662,7 +7662,7 @@
         </w:tc>
         <w:tc>
           <w:tcPr>
-            <w:tcW w:w="3168" w:type="dxa"/>
+            <w:tcW w:w="3203" w:type="dxa"/>
             <w:tcBorders>
               <w:top w:val="single" w:sz="4" w:space="0" w:color="808080"/>
               <w:left w:val="single" w:sz="4" w:space="0" w:color="808080"/>
@@ -7694,7 +7694,7 @@
         </w:tc>
         <w:tc>
           <w:tcPr>
-            <w:tcW w:w="1728" w:type="dxa"/>
+            <w:tcW w:w="1747" w:type="dxa"/>
             <w:tcBorders>
               <w:top w:val="single" w:sz="4" w:space="0" w:color="808080"/>
               <w:left w:val="single" w:sz="4" w:space="0" w:color="808080"/>
@@ -7731,7 +7731,7 @@
         </w:trPr>
         <w:tc>
           <w:tcPr>
-            <w:tcW w:w="1296" w:type="dxa"/>
+            <w:tcW w:w="1310" w:type="dxa"/>
             <w:tcBorders>
               <w:top w:val="single" w:sz="4" w:space="0" w:color="808080"/>
               <w:left w:val="single" w:sz="4" w:space="0" w:color="808080"/>
@@ -7760,7 +7760,7 @@
         </w:tc>
         <w:tc>
           <w:tcPr>
-            <w:tcW w:w="2736" w:type="dxa"/>
+            <w:tcW w:w="2766" w:type="dxa"/>
             <w:tcBorders>
               <w:top w:val="single" w:sz="4" w:space="0" w:color="808080"/>
               <w:left w:val="single" w:sz="4" w:space="0" w:color="808080"/>
@@ -7789,7 +7789,7 @@
         </w:tc>
         <w:tc>
           <w:tcPr>
-            <w:tcW w:w="3168" w:type="dxa"/>
+            <w:tcW w:w="3203" w:type="dxa"/>
             <w:tcBorders>
               <w:top w:val="single" w:sz="4" w:space="0" w:color="808080"/>
               <w:left w:val="single" w:sz="4" w:space="0" w:color="808080"/>
@@ -7818,7 +7818,7 @@
         </w:tc>
         <w:tc>
           <w:tcPr>
-            <w:tcW w:w="1728" w:type="dxa"/>
+            <w:tcW w:w="1747" w:type="dxa"/>
             <w:tcBorders>
               <w:top w:val="single" w:sz="4" w:space="0" w:color="808080"/>
               <w:left w:val="single" w:sz="4" w:space="0" w:color="808080"/>
@@ -7852,7 +7852,7 @@
         </w:trPr>
         <w:tc>
           <w:tcPr>
-            <w:tcW w:w="1296" w:type="dxa"/>
+            <w:tcW w:w="1310" w:type="dxa"/>
             <w:tcBorders>
               <w:top w:val="single" w:sz="4" w:space="0" w:color="808080"/>
               <w:left w:val="single" w:sz="4" w:space="0" w:color="808080"/>
@@ -7881,7 +7881,7 @@
         </w:tc>
         <w:tc>
           <w:tcPr>
-            <w:tcW w:w="2736" w:type="dxa"/>
+            <w:tcW w:w="2766" w:type="dxa"/>
             <w:tcBorders>
               <w:top w:val="single" w:sz="4" w:space="0" w:color="808080"/>
               <w:left w:val="single" w:sz="4" w:space="0" w:color="808080"/>
@@ -7910,7 +7910,7 @@
         </w:tc>
         <w:tc>
           <w:tcPr>
-            <w:tcW w:w="3168" w:type="dxa"/>
+            <w:tcW w:w="3203" w:type="dxa"/>
             <w:tcBorders>
               <w:top w:val="single" w:sz="4" w:space="0" w:color="808080"/>
               <w:left w:val="single" w:sz="4" w:space="0" w:color="808080"/>
@@ -7939,7 +7939,7 @@
         </w:tc>
         <w:tc>
           <w:tcPr>
-            <w:tcW w:w="1728" w:type="dxa"/>
+            <w:tcW w:w="1747" w:type="dxa"/>
             <w:tcBorders>
               <w:top w:val="single" w:sz="4" w:space="0" w:color="808080"/>
               <w:left w:val="single" w:sz="4" w:space="0" w:color="808080"/>
@@ -7973,7 +7973,7 @@
         </w:trPr>
         <w:tc>
           <w:tcPr>
-            <w:tcW w:w="1296" w:type="dxa"/>
+            <w:tcW w:w="1310" w:type="dxa"/>
             <w:tcBorders>
               <w:top w:val="single" w:sz="4" w:space="0" w:color="808080"/>
               <w:left w:val="single" w:sz="4" w:space="0" w:color="808080"/>
@@ -8002,7 +8002,7 @@
         </w:tc>
         <w:tc>
           <w:tcPr>
-            <w:tcW w:w="2736" w:type="dxa"/>
+            <w:tcW w:w="2766" w:type="dxa"/>
             <w:tcBorders>
               <w:top w:val="single" w:sz="4" w:space="0" w:color="808080"/>
               <w:left w:val="single" w:sz="4" w:space="0" w:color="808080"/>
@@ -8031,7 +8031,7 @@
         </w:tc>
         <w:tc>
           <w:tcPr>
-            <w:tcW w:w="3168" w:type="dxa"/>
+            <w:tcW w:w="3203" w:type="dxa"/>
             <w:tcBorders>
               <w:top w:val="single" w:sz="4" w:space="0" w:color="808080"/>
               <w:left w:val="single" w:sz="4" w:space="0" w:color="808080"/>
@@ -8060,7 +8060,7 @@
         </w:tc>
         <w:tc>
           <w:tcPr>
-            <w:tcW w:w="1728" w:type="dxa"/>
+            <w:tcW w:w="1747" w:type="dxa"/>
             <w:tcBorders>
               <w:top w:val="single" w:sz="4" w:space="0" w:color="808080"/>
               <w:left w:val="single" w:sz="4" w:space="0" w:color="808080"/>
@@ -8284,11 +8284,11 @@
         <w:tblLook w:val="04A0" w:firstRow="1" w:lastRow="0" w:firstColumn="1" w:lastColumn="0" w:noHBand="0" w:noVBand="1"/>
       </w:tblPr>
       <w:tblGrid>
-        <w:gridCol w:w="1512"/>
-        <w:gridCol w:w="1800"/>
-        <w:gridCol w:w="1368"/>
-        <w:gridCol w:w="3311"/>
-        <w:gridCol w:w="1007"/>
+        <w:gridCol w:w="1516"/>
+        <w:gridCol w:w="1805"/>
+        <w:gridCol w:w="1372"/>
+        <w:gridCol w:w="3322"/>
+        <w:gridCol w:w="1011"/>
       </w:tblGrid>
       <w:tr>
         <w:trPr>
@@ -8297,7 +8297,7 @@
         </w:trPr>
         <w:tc>
           <w:tcPr>
-            <w:tcW w:w="1512" w:type="dxa"/>
+            <w:tcW w:w="1516" w:type="dxa"/>
             <w:tcBorders>
               <w:top w:val="single" w:sz="4" w:space="0" w:color="808080"/>
               <w:left w:val="single" w:sz="4" w:space="0" w:color="808080"/>
@@ -8329,7 +8329,7 @@
         </w:tc>
         <w:tc>
           <w:tcPr>
-            <w:tcW w:w="1800" w:type="dxa"/>
+            <w:tcW w:w="1805" w:type="dxa"/>
             <w:tcBorders>
               <w:top w:val="single" w:sz="4" w:space="0" w:color="808080"/>
               <w:left w:val="single" w:sz="4" w:space="0" w:color="808080"/>
@@ -8361,7 +8361,7 @@
         </w:tc>
         <w:tc>
           <w:tcPr>
-            <w:tcW w:w="1368" w:type="dxa"/>
+            <w:tcW w:w="1372" w:type="dxa"/>
             <w:tcBorders>
               <w:top w:val="single" w:sz="4" w:space="0" w:color="808080"/>
               <w:left w:val="single" w:sz="4" w:space="0" w:color="808080"/>
@@ -8393,7 +8393,7 @@
         </w:tc>
         <w:tc>
           <w:tcPr>
-            <w:tcW w:w="3312" w:type="dxa"/>
+            <w:tcW w:w="3322" w:type="dxa"/>
             <w:tcBorders>
               <w:top w:val="single" w:sz="4" w:space="0" w:color="808080"/>
               <w:left w:val="single" w:sz="4" w:space="0" w:color="808080"/>
@@ -8425,7 +8425,7 @@
         </w:tc>
         <w:tc>
           <w:tcPr>
-            <w:tcW w:w="1008" w:type="dxa"/>
+            <w:tcW w:w="1011" w:type="dxa"/>
             <w:tcBorders>
               <w:top w:val="single" w:sz="4" w:space="0" w:color="808080"/>
               <w:left w:val="single" w:sz="4" w:space="0" w:color="808080"/>
@@ -8462,7 +8462,7 @@
         </w:trPr>
         <w:tc>
           <w:tcPr>
-            <w:tcW w:w="1512" w:type="dxa"/>
+            <w:tcW w:w="1516" w:type="dxa"/>
             <w:tcBorders>
               <w:top w:val="single" w:sz="4" w:space="0" w:color="808080"/>
               <w:left w:val="single" w:sz="4" w:space="0" w:color="808080"/>
@@ -8491,7 +8491,7 @@
         </w:tc>
         <w:tc>
           <w:tcPr>
-            <w:tcW w:w="1800" w:type="dxa"/>
+            <w:tcW w:w="1805" w:type="dxa"/>
             <w:tcBorders>
               <w:top w:val="single" w:sz="4" w:space="0" w:color="808080"/>
               <w:left w:val="single" w:sz="4" w:space="0" w:color="808080"/>
@@ -8520,7 +8520,7 @@
         </w:tc>
         <w:tc>
           <w:tcPr>
-            <w:tcW w:w="1368" w:type="dxa"/>
+            <w:tcW w:w="1372" w:type="dxa"/>
             <w:tcBorders>
               <w:top w:val="single" w:sz="4" w:space="0" w:color="808080"/>
               <w:left w:val="single" w:sz="4" w:space="0" w:color="808080"/>
@@ -8549,7 +8549,7 @@
         </w:tc>
         <w:tc>
           <w:tcPr>
-            <w:tcW w:w="3312" w:type="dxa"/>
+            <w:tcW w:w="3322" w:type="dxa"/>
             <w:tcBorders>
               <w:top w:val="single" w:sz="4" w:space="0" w:color="808080"/>
               <w:left w:val="single" w:sz="4" w:space="0" w:color="808080"/>
@@ -8578,7 +8578,7 @@
         </w:tc>
         <w:tc>
           <w:tcPr>
-            <w:tcW w:w="1008" w:type="dxa"/>
+            <w:tcW w:w="1011" w:type="dxa"/>
             <w:tcBorders>
               <w:top w:val="single" w:sz="4" w:space="0" w:color="808080"/>
               <w:left w:val="single" w:sz="4" w:space="0" w:color="808080"/>
@@ -8612,7 +8612,7 @@
         </w:trPr>
         <w:tc>
           <w:tcPr>
-            <w:tcW w:w="1512" w:type="dxa"/>
+            <w:tcW w:w="1516" w:type="dxa"/>
             <w:tcBorders>
               <w:top w:val="single" w:sz="4" w:space="0" w:color="808080"/>
               <w:left w:val="single" w:sz="4" w:space="0" w:color="808080"/>
@@ -8641,7 +8641,7 @@
         </w:tc>
         <w:tc>
           <w:tcPr>
-            <w:tcW w:w="1800" w:type="dxa"/>
+            <w:tcW w:w="1805" w:type="dxa"/>
             <w:tcBorders>
               <w:top w:val="single" w:sz="4" w:space="0" w:color="808080"/>
               <w:left w:val="single" w:sz="4" w:space="0" w:color="808080"/>
@@ -8670,7 +8670,7 @@
         </w:tc>
         <w:tc>
           <w:tcPr>
-            <w:tcW w:w="1368" w:type="dxa"/>
+            <w:tcW w:w="1372" w:type="dxa"/>
             <w:tcBorders>
               <w:top w:val="single" w:sz="4" w:space="0" w:color="808080"/>
               <w:left w:val="single" w:sz="4" w:space="0" w:color="808080"/>
@@ -8699,7 +8699,7 @@
         </w:tc>
         <w:tc>
           <w:tcPr>
-            <w:tcW w:w="3312" w:type="dxa"/>
+            <w:tcW w:w="3322" w:type="dxa"/>
             <w:tcBorders>
               <w:top w:val="single" w:sz="4" w:space="0" w:color="808080"/>
               <w:left w:val="single" w:sz="4" w:space="0" w:color="808080"/>
@@ -8728,7 +8728,7 @@
         </w:tc>
         <w:tc>
           <w:tcPr>
-            <w:tcW w:w="1008" w:type="dxa"/>
+            <w:tcW w:w="1011" w:type="dxa"/>
             <w:tcBorders>
               <w:top w:val="single" w:sz="4" w:space="0" w:color="808080"/>
               <w:left w:val="single" w:sz="4" w:space="0" w:color="808080"/>
@@ -8762,7 +8762,7 @@
         </w:trPr>
         <w:tc>
           <w:tcPr>
-            <w:tcW w:w="1512" w:type="dxa"/>
+            <w:tcW w:w="1516" w:type="dxa"/>
             <w:tcBorders>
               <w:top w:val="single" w:sz="4" w:space="0" w:color="808080"/>
               <w:left w:val="single" w:sz="4" w:space="0" w:color="808080"/>
@@ -8791,7 +8791,7 @@
         </w:tc>
         <w:tc>
           <w:tcPr>
-            <w:tcW w:w="1800" w:type="dxa"/>
+            <w:tcW w:w="1805" w:type="dxa"/>
             <w:tcBorders>
               <w:top w:val="single" w:sz="4" w:space="0" w:color="808080"/>
               <w:left w:val="single" w:sz="4" w:space="0" w:color="808080"/>
@@ -8820,7 +8820,7 @@
         </w:tc>
         <w:tc>
           <w:tcPr>
-            <w:tcW w:w="1368" w:type="dxa"/>
+            <w:tcW w:w="1372" w:type="dxa"/>
             <w:tcBorders>
               <w:top w:val="single" w:sz="4" w:space="0" w:color="808080"/>
               <w:left w:val="single" w:sz="4" w:space="0" w:color="808080"/>
@@ -8849,7 +8849,7 @@
         </w:tc>
         <w:tc>
           <w:tcPr>
-            <w:tcW w:w="3312" w:type="dxa"/>
+            <w:tcW w:w="3322" w:type="dxa"/>
             <w:tcBorders>
               <w:top w:val="single" w:sz="4" w:space="0" w:color="808080"/>
               <w:left w:val="single" w:sz="4" w:space="0" w:color="808080"/>
@@ -8878,7 +8878,7 @@
         </w:tc>
         <w:tc>
           <w:tcPr>
-            <w:tcW w:w="1008" w:type="dxa"/>
+            <w:tcW w:w="1011" w:type="dxa"/>
             <w:tcBorders>
               <w:top w:val="single" w:sz="4" w:space="0" w:color="808080"/>
               <w:left w:val="single" w:sz="4" w:space="0" w:color="808080"/>
@@ -8912,7 +8912,7 @@
         </w:trPr>
         <w:tc>
           <w:tcPr>
-            <w:tcW w:w="1512" w:type="dxa"/>
+            <w:tcW w:w="1516" w:type="dxa"/>
             <w:tcBorders>
               <w:top w:val="single" w:sz="4" w:space="0" w:color="808080"/>
               <w:left w:val="single" w:sz="4" w:space="0" w:color="808080"/>
@@ -8941,7 +8941,7 @@
         </w:tc>
         <w:tc>
           <w:tcPr>
-            <w:tcW w:w="1800" w:type="dxa"/>
+            <w:tcW w:w="1805" w:type="dxa"/>
             <w:tcBorders>
               <w:top w:val="single" w:sz="4" w:space="0" w:color="808080"/>
               <w:left w:val="single" w:sz="4" w:space="0" w:color="808080"/>
@@ -8970,7 +8970,7 @@
         </w:tc>
         <w:tc>
           <w:tcPr>
-            <w:tcW w:w="1368" w:type="dxa"/>
+            <w:tcW w:w="1372" w:type="dxa"/>
             <w:tcBorders>
               <w:top w:val="single" w:sz="4" w:space="0" w:color="808080"/>
               <w:left w:val="single" w:sz="4" w:space="0" w:color="808080"/>
@@ -8999,7 +8999,7 @@
         </w:tc>
         <w:tc>
           <w:tcPr>
-            <w:tcW w:w="3312" w:type="dxa"/>
+            <w:tcW w:w="3322" w:type="dxa"/>
             <w:tcBorders>
               <w:top w:val="single" w:sz="4" w:space="0" w:color="808080"/>
               <w:left w:val="single" w:sz="4" w:space="0" w:color="808080"/>
@@ -9028,7 +9028,7 @@
         </w:tc>
         <w:tc>
           <w:tcPr>
-            <w:tcW w:w="1008" w:type="dxa"/>
+            <w:tcW w:w="1011" w:type="dxa"/>
             <w:tcBorders>
               <w:top w:val="single" w:sz="4" w:space="0" w:color="808080"/>
               <w:left w:val="single" w:sz="4" w:space="0" w:color="808080"/>
@@ -9415,10 +9415,10 @@
         <w:tblLook w:val="04A0" w:firstRow="1" w:lastRow="0" w:firstColumn="1" w:lastColumn="0" w:noHBand="0" w:noVBand="1"/>
       </w:tblPr>
       <w:tblGrid>
-        <w:gridCol w:w="2304"/>
-        <w:gridCol w:w="1224"/>
-        <w:gridCol w:w="2304"/>
-        <w:gridCol w:w="3096"/>
+        <w:gridCol w:w="2329"/>
+        <w:gridCol w:w="1237"/>
+        <w:gridCol w:w="2329"/>
+        <w:gridCol w:w="3131"/>
       </w:tblGrid>
       <w:tr>
         <w:trPr>
@@ -9427,7 +9427,7 @@
         </w:trPr>
         <w:tc>
           <w:tcPr>
-            <w:tcW w:w="2304" w:type="dxa"/>
+            <w:tcW w:w="2329" w:type="dxa"/>
             <w:tcBorders>
               <w:top w:val="single" w:sz="4" w:space="0" w:color="808080"/>
               <w:left w:val="single" w:sz="4" w:space="0" w:color="808080"/>
@@ -9456,7 +9456,7 @@
         </w:tc>
         <w:tc>
           <w:tcPr>
-            <w:tcW w:w="1224" w:type="dxa"/>
+            <w:tcW w:w="1237" w:type="dxa"/>
             <w:tcBorders>
               <w:top w:val="single" w:sz="4" w:space="0" w:color="808080"/>
               <w:left w:val="single" w:sz="4" w:space="0" w:color="808080"/>
@@ -9485,7 +9485,7 @@
         </w:tc>
         <w:tc>
           <w:tcPr>
-            <w:tcW w:w="2304" w:type="dxa"/>
+            <w:tcW w:w="2329" w:type="dxa"/>
             <w:tcBorders>
               <w:top w:val="single" w:sz="4" w:space="0" w:color="808080"/>
               <w:left w:val="single" w:sz="4" w:space="0" w:color="808080"/>
@@ -9514,7 +9514,7 @@
         </w:tc>
         <w:tc>
           <w:tcPr>
-            <w:tcW w:w="3096" w:type="dxa"/>
+            <w:tcW w:w="3131" w:type="dxa"/>
             <w:tcBorders>
               <w:top w:val="single" w:sz="4" w:space="0" w:color="808080"/>
               <w:left w:val="single" w:sz="4" w:space="0" w:color="808080"/>
@@ -9548,7 +9548,7 @@
         </w:trPr>
         <w:tc>
           <w:tcPr>
-            <w:tcW w:w="2304" w:type="dxa"/>
+            <w:tcW w:w="2329" w:type="dxa"/>
             <w:tcBorders>
               <w:top w:val="single" w:sz="4" w:space="0" w:color="808080"/>
               <w:left w:val="single" w:sz="4" w:space="0" w:color="808080"/>
@@ -9574,7 +9574,7 @@
         </w:tc>
         <w:tc>
           <w:tcPr>
-            <w:tcW w:w="1224" w:type="dxa"/>
+            <w:tcW w:w="1237" w:type="dxa"/>
             <w:tcBorders>
               <w:top w:val="single" w:sz="4" w:space="0" w:color="808080"/>
               <w:left w:val="single" w:sz="4" w:space="0" w:color="808080"/>
@@ -9600,7 +9600,7 @@
         </w:tc>
         <w:tc>
           <w:tcPr>
-            <w:tcW w:w="2304" w:type="dxa"/>
+            <w:tcW w:w="2329" w:type="dxa"/>
             <w:tcBorders>
               <w:top w:val="single" w:sz="4" w:space="0" w:color="808080"/>
               <w:left w:val="single" w:sz="4" w:space="0" w:color="808080"/>
@@ -9626,7 +9626,7 @@
         </w:tc>
         <w:tc>
           <w:tcPr>
-            <w:tcW w:w="3096" w:type="dxa"/>
+            <w:tcW w:w="3131" w:type="dxa"/>
             <w:tcBorders>
               <w:top w:val="single" w:sz="4" w:space="0" w:color="808080"/>
               <w:left w:val="single" w:sz="4" w:space="0" w:color="808080"/>
@@ -9657,7 +9657,7 @@
         </w:trPr>
         <w:tc>
           <w:tcPr>
-            <w:tcW w:w="2304" w:type="dxa"/>
+            <w:tcW w:w="2329" w:type="dxa"/>
             <w:tcBorders>
               <w:top w:val="single" w:sz="4" w:space="0" w:color="808080"/>
               <w:left w:val="single" w:sz="4" w:space="0" w:color="808080"/>
@@ -9683,7 +9683,7 @@
         </w:tc>
         <w:tc>
           <w:tcPr>
-            <w:tcW w:w="1224" w:type="dxa"/>
+            <w:tcW w:w="1237" w:type="dxa"/>
             <w:tcBorders>
               <w:top w:val="single" w:sz="4" w:space="0" w:color="808080"/>
               <w:left w:val="single" w:sz="4" w:space="0" w:color="808080"/>
@@ -9709,7 +9709,7 @@
         </w:tc>
         <w:tc>
           <w:tcPr>
-            <w:tcW w:w="2304" w:type="dxa"/>
+            <w:tcW w:w="2329" w:type="dxa"/>
             <w:tcBorders>
               <w:top w:val="single" w:sz="4" w:space="0" w:color="808080"/>
               <w:left w:val="single" w:sz="4" w:space="0" w:color="808080"/>
@@ -9735,7 +9735,7 @@
         </w:tc>
         <w:tc>
           <w:tcPr>
-            <w:tcW w:w="3096" w:type="dxa"/>
+            <w:tcW w:w="3131" w:type="dxa"/>
             <w:tcBorders>
               <w:top w:val="single" w:sz="4" w:space="0" w:color="808080"/>
               <w:left w:val="single" w:sz="4" w:space="0" w:color="808080"/>
@@ -9766,7 +9766,7 @@
         </w:trPr>
         <w:tc>
           <w:tcPr>
-            <w:tcW w:w="2304" w:type="dxa"/>
+            <w:tcW w:w="2329" w:type="dxa"/>
             <w:tcBorders>
               <w:top w:val="single" w:sz="4" w:space="0" w:color="808080"/>
               <w:left w:val="single" w:sz="4" w:space="0" w:color="808080"/>
@@ -9792,7 +9792,7 @@
         </w:tc>
         <w:tc>
           <w:tcPr>
-            <w:tcW w:w="1224" w:type="dxa"/>
+            <w:tcW w:w="1237" w:type="dxa"/>
             <w:tcBorders>
               <w:top w:val="single" w:sz="4" w:space="0" w:color="808080"/>
               <w:left w:val="single" w:sz="4" w:space="0" w:color="808080"/>
@@ -9818,7 +9818,7 @@
         </w:tc>
         <w:tc>
           <w:tcPr>
-            <w:tcW w:w="2304" w:type="dxa"/>
+            <w:tcW w:w="2329" w:type="dxa"/>
             <w:tcBorders>
               <w:top w:val="single" w:sz="4" w:space="0" w:color="808080"/>
               <w:left w:val="single" w:sz="4" w:space="0" w:color="808080"/>
@@ -9844,7 +9844,7 @@
         </w:tc>
         <w:tc>
           <w:tcPr>
-            <w:tcW w:w="3096" w:type="dxa"/>
+            <w:tcW w:w="3131" w:type="dxa"/>
             <w:tcBorders>
               <w:top w:val="single" w:sz="4" w:space="0" w:color="808080"/>
               <w:left w:val="single" w:sz="4" w:space="0" w:color="808080"/>
@@ -9875,7 +9875,7 @@
         </w:trPr>
         <w:tc>
           <w:tcPr>
-            <w:tcW w:w="2304" w:type="dxa"/>
+            <w:tcW w:w="2329" w:type="dxa"/>
             <w:tcBorders>
               <w:top w:val="single" w:sz="4" w:space="0" w:color="808080"/>
               <w:left w:val="single" w:sz="4" w:space="0" w:color="808080"/>
@@ -9901,7 +9901,7 @@
         </w:tc>
         <w:tc>
           <w:tcPr>
-            <w:tcW w:w="1224" w:type="dxa"/>
+            <w:tcW w:w="1237" w:type="dxa"/>
             <w:tcBorders>
               <w:top w:val="single" w:sz="4" w:space="0" w:color="808080"/>
               <w:left w:val="single" w:sz="4" w:space="0" w:color="808080"/>
@@ -9927,7 +9927,7 @@
         </w:tc>
         <w:tc>
           <w:tcPr>
-            <w:tcW w:w="2304" w:type="dxa"/>
+            <w:tcW w:w="2329" w:type="dxa"/>
             <w:tcBorders>
               <w:top w:val="single" w:sz="4" w:space="0" w:color="808080"/>
               <w:left w:val="single" w:sz="4" w:space="0" w:color="808080"/>
@@ -9953,7 +9953,7 @@
         </w:tc>
         <w:tc>
           <w:tcPr>
-            <w:tcW w:w="3096" w:type="dxa"/>
+            <w:tcW w:w="3131" w:type="dxa"/>
             <w:tcBorders>
               <w:top w:val="single" w:sz="4" w:space="0" w:color="808080"/>
               <w:left w:val="single" w:sz="4" w:space="0" w:color="808080"/>
@@ -9984,7 +9984,7 @@
         </w:trPr>
         <w:tc>
           <w:tcPr>
-            <w:tcW w:w="2304" w:type="dxa"/>
+            <w:tcW w:w="2329" w:type="dxa"/>
             <w:tcBorders>
               <w:top w:val="single" w:sz="4" w:space="0" w:color="808080"/>
               <w:left w:val="single" w:sz="4" w:space="0" w:color="808080"/>
@@ -10010,7 +10010,7 @@
         </w:tc>
         <w:tc>
           <w:tcPr>
-            <w:tcW w:w="1224" w:type="dxa"/>
+            <w:tcW w:w="1237" w:type="dxa"/>
             <w:tcBorders>
               <w:top w:val="single" w:sz="4" w:space="0" w:color="808080"/>
               <w:left w:val="single" w:sz="4" w:space="0" w:color="808080"/>
@@ -10036,7 +10036,7 @@
         </w:tc>
         <w:tc>
           <w:tcPr>
-            <w:tcW w:w="2304" w:type="dxa"/>
+            <w:tcW w:w="2329" w:type="dxa"/>
             <w:tcBorders>
               <w:top w:val="single" w:sz="4" w:space="0" w:color="808080"/>
               <w:left w:val="single" w:sz="4" w:space="0" w:color="808080"/>
@@ -10062,7 +10062,7 @@
         </w:tc>
         <w:tc>
           <w:tcPr>
-            <w:tcW w:w="3096" w:type="dxa"/>
+            <w:tcW w:w="3131" w:type="dxa"/>
             <w:tcBorders>
               <w:top w:val="single" w:sz="4" w:space="0" w:color="808080"/>
               <w:left w:val="single" w:sz="4" w:space="0" w:color="808080"/>
@@ -10093,7 +10093,7 @@
         </w:trPr>
         <w:tc>
           <w:tcPr>
-            <w:tcW w:w="2304" w:type="dxa"/>
+            <w:tcW w:w="2329" w:type="dxa"/>
             <w:tcBorders>
               <w:top w:val="single" w:sz="4" w:space="0" w:color="808080"/>
               <w:left w:val="single" w:sz="4" w:space="0" w:color="808080"/>
@@ -10119,7 +10119,7 @@
         </w:tc>
         <w:tc>
           <w:tcPr>
-            <w:tcW w:w="1224" w:type="dxa"/>
+            <w:tcW w:w="1237" w:type="dxa"/>
             <w:tcBorders>
               <w:top w:val="single" w:sz="4" w:space="0" w:color="808080"/>
               <w:left w:val="single" w:sz="4" w:space="0" w:color="808080"/>
@@ -10145,7 +10145,7 @@
         </w:tc>
         <w:tc>
           <w:tcPr>
-            <w:tcW w:w="2304" w:type="dxa"/>
+            <w:tcW w:w="2329" w:type="dxa"/>
             <w:tcBorders>
               <w:top w:val="single" w:sz="4" w:space="0" w:color="808080"/>
               <w:left w:val="single" w:sz="4" w:space="0" w:color="808080"/>
@@ -10171,7 +10171,7 @@
         </w:tc>
         <w:tc>
           <w:tcPr>
-            <w:tcW w:w="3096" w:type="dxa"/>
+            <w:tcW w:w="3131" w:type="dxa"/>
             <w:tcBorders>
               <w:top w:val="single" w:sz="4" w:space="0" w:color="808080"/>
               <w:left w:val="single" w:sz="4" w:space="0" w:color="808080"/>
@@ -10202,7 +10202,7 @@
         </w:trPr>
         <w:tc>
           <w:tcPr>
-            <w:tcW w:w="2304" w:type="dxa"/>
+            <w:tcW w:w="2329" w:type="dxa"/>
             <w:tcBorders>
               <w:top w:val="single" w:sz="4" w:space="0" w:color="808080"/>
               <w:left w:val="single" w:sz="4" w:space="0" w:color="808080"/>
@@ -10228,7 +10228,7 @@
         </w:tc>
         <w:tc>
           <w:tcPr>
-            <w:tcW w:w="1224" w:type="dxa"/>
+            <w:tcW w:w="1237" w:type="dxa"/>
             <w:tcBorders>
               <w:top w:val="single" w:sz="4" w:space="0" w:color="808080"/>
               <w:left w:val="single" w:sz="4" w:space="0" w:color="808080"/>
@@ -10254,7 +10254,7 @@
         </w:tc>
         <w:tc>
           <w:tcPr>
-            <w:tcW w:w="2304" w:type="dxa"/>
+            <w:tcW w:w="2329" w:type="dxa"/>
             <w:tcBorders>
               <w:top w:val="single" w:sz="4" w:space="0" w:color="808080"/>
               <w:left w:val="single" w:sz="4" w:space="0" w:color="808080"/>
@@ -10280,7 +10280,7 @@
         </w:tc>
         <w:tc>
           <w:tcPr>
-            <w:tcW w:w="3096" w:type="dxa"/>
+            <w:tcW w:w="3131" w:type="dxa"/>
             <w:tcBorders>
               <w:top w:val="single" w:sz="4" w:space="0" w:color="808080"/>
               <w:left w:val="single" w:sz="4" w:space="0" w:color="808080"/>
@@ -10311,7 +10311,7 @@
         </w:trPr>
         <w:tc>
           <w:tcPr>
-            <w:tcW w:w="2304" w:type="dxa"/>
+            <w:tcW w:w="2329" w:type="dxa"/>
             <w:tcBorders>
               <w:top w:val="single" w:sz="4" w:space="0" w:color="808080"/>
               <w:left w:val="single" w:sz="4" w:space="0" w:color="808080"/>
@@ -10337,7 +10337,7 @@
         </w:tc>
         <w:tc>
           <w:tcPr>
-            <w:tcW w:w="1224" w:type="dxa"/>
+            <w:tcW w:w="1237" w:type="dxa"/>
             <w:tcBorders>
               <w:top w:val="single" w:sz="4" w:space="0" w:color="808080"/>
               <w:left w:val="single" w:sz="4" w:space="0" w:color="808080"/>
@@ -10363,7 +10363,7 @@
         </w:tc>
         <w:tc>
           <w:tcPr>
-            <w:tcW w:w="2304" w:type="dxa"/>
+            <w:tcW w:w="2329" w:type="dxa"/>
             <w:tcBorders>
               <w:top w:val="single" w:sz="4" w:space="0" w:color="808080"/>
               <w:left w:val="single" w:sz="4" w:space="0" w:color="808080"/>
@@ -10389,7 +10389,7 @@
         </w:tc>
         <w:tc>
           <w:tcPr>
-            <w:tcW w:w="3096" w:type="dxa"/>
+            <w:tcW w:w="3131" w:type="dxa"/>
             <w:tcBorders>
               <w:top w:val="single" w:sz="4" w:space="0" w:color="808080"/>
               <w:left w:val="single" w:sz="4" w:space="0" w:color="808080"/>

</xml_diff>